<commit_message>
Modificacion a tipo de letra y centrado de datos de tabla en la plantilla
</commit_message>
<xml_diff>
--- a/plantillas/plantilla_cotizacion.docx
+++ b/plantillas/plantilla_cotizacion.docx
@@ -16,6 +16,9 @@
         </w:rPr>
       </w:pPr>
       <w:r>
+        <w:rPr>
+          <w:rFonts w:ascii="Century Gothic" w:hAnsi="Century Gothic"/>
+        </w:rPr>
         <w:t>{{ ciudad }}, {{ fecha }}</w:t>
       </w:r>
     </w:p>
@@ -71,6 +74,9 @@
         </w:rPr>
       </w:pPr>
       <w:r>
+        <w:rPr>
+          <w:rFonts w:ascii="Century Gothic" w:hAnsi="Century Gothic"/>
+        </w:rPr>
         <w:t>{{ nombre_cliente }}</w:t>
       </w:r>
     </w:p>
@@ -488,16 +494,7 @@
                 <w:szCs w:val="18"/>
                 <w:lang w:val="es-ES"/>
               </w:rPr>
-              <w:t>Alto</w:t>
-            </w:r>
-            <w:r>
-              <w:rPr>
-                <w:rFonts w:ascii="Century Gothic" w:eastAsia="Carlito" w:hAnsi="Century Gothic" w:cs="Carlito"/>
-                <w:sz w:val="20"/>
-                <w:szCs w:val="18"/>
-                <w:lang w:val="es-ES"/>
-              </w:rPr>
-              <w:t xml:space="preserve"> </w:t>
+              <w:t xml:space="preserve">Alto </w:t>
             </w:r>
           </w:p>
           <w:p>
@@ -645,10 +642,23 @@
             <w:vAlign w:val="center"/>
           </w:tcPr>
           <w:p>
+            <w:pPr>
+              <w:jc w:val="center"/>
+              <w:rPr>
+                <w:rFonts w:ascii="Century Gothic" w:hAnsi="Century Gothic"/>
+              </w:rPr>
+            </w:pPr>
+            <w:bookmarkStart w:id="0" w:name="_GoBack" w:colFirst="0" w:colLast="7"/>
             <w:r>
+              <w:rPr>
+                <w:rFonts w:ascii="Century Gothic" w:hAnsi="Century Gothic"/>
+              </w:rPr>
               <w:t>{{largo_ext}}</w:t>
             </w:r>
             <w:r>
+              <w:rPr>
+                <w:rFonts w:ascii="Century Gothic" w:hAnsi="Century Gothic"/>
+              </w:rPr>
               <w:t>m</w:t>
             </w:r>
           </w:p>
@@ -659,10 +669,22 @@
             <w:vAlign w:val="center"/>
           </w:tcPr>
           <w:p>
+            <w:pPr>
+              <w:jc w:val="center"/>
+              <w:rPr>
+                <w:rFonts w:ascii="Century Gothic" w:hAnsi="Century Gothic"/>
+              </w:rPr>
+            </w:pPr>
             <w:r>
+              <w:rPr>
+                <w:rFonts w:ascii="Century Gothic" w:hAnsi="Century Gothic"/>
+              </w:rPr>
               <w:t>{{ancho_ext}}</w:t>
             </w:r>
             <w:r>
+              <w:rPr>
+                <w:rFonts w:ascii="Century Gothic" w:hAnsi="Century Gothic"/>
+              </w:rPr>
               <w:t>m</w:t>
             </w:r>
           </w:p>
@@ -673,10 +695,22 @@
             <w:vAlign w:val="center"/>
           </w:tcPr>
           <w:p>
+            <w:pPr>
+              <w:jc w:val="center"/>
+              <w:rPr>
+                <w:rFonts w:ascii="Century Gothic" w:hAnsi="Century Gothic"/>
+              </w:rPr>
+            </w:pPr>
             <w:r>
+              <w:rPr>
+                <w:rFonts w:ascii="Century Gothic" w:hAnsi="Century Gothic"/>
+              </w:rPr>
               <w:t>{{alto_ext}}</w:t>
             </w:r>
             <w:r>
+              <w:rPr>
+                <w:rFonts w:ascii="Century Gothic" w:hAnsi="Century Gothic"/>
+              </w:rPr>
               <w:t>m</w:t>
             </w:r>
           </w:p>
@@ -687,7 +721,16 @@
             <w:vAlign w:val="center"/>
           </w:tcPr>
           <w:p>
+            <w:pPr>
+              <w:jc w:val="center"/>
+              <w:rPr>
+                <w:rFonts w:ascii="Century Gothic" w:hAnsi="Century Gothic"/>
+              </w:rPr>
+            </w:pPr>
             <w:r>
+              <w:rPr>
+                <w:rFonts w:ascii="Century Gothic" w:hAnsi="Century Gothic"/>
+              </w:rPr>
               <w:t>{{tipo_carroceria}}</w:t>
             </w:r>
           </w:p>
@@ -698,7 +741,16 @@
             <w:vAlign w:val="center"/>
           </w:tcPr>
           <w:p>
+            <w:pPr>
+              <w:jc w:val="center"/>
+              <w:rPr>
+                <w:rFonts w:ascii="Century Gothic" w:hAnsi="Century Gothic"/>
+              </w:rPr>
+            </w:pPr>
             <w:r>
+              <w:rPr>
+                <w:rFonts w:ascii="Century Gothic" w:hAnsi="Century Gothic"/>
+              </w:rPr>
               <w:t>{{peso_kg}}</w:t>
             </w:r>
           </w:p>
@@ -709,7 +761,16 @@
             <w:vAlign w:val="center"/>
           </w:tcPr>
           <w:p>
+            <w:pPr>
+              <w:jc w:val="center"/>
+              <w:rPr>
+                <w:rFonts w:ascii="Century Gothic" w:hAnsi="Century Gothic"/>
+              </w:rPr>
+            </w:pPr>
             <w:r>
+              <w:rPr>
+                <w:rFonts w:ascii="Century Gothic" w:hAnsi="Century Gothic"/>
+              </w:rPr>
               <w:t>{{valor_c_rra}}</w:t>
             </w:r>
           </w:p>
@@ -720,7 +781,16 @@
             <w:vAlign w:val="center"/>
           </w:tcPr>
           <w:p>
+            <w:pPr>
+              <w:jc w:val="center"/>
+              <w:rPr>
+                <w:rFonts w:ascii="Century Gothic" w:hAnsi="Century Gothic"/>
+              </w:rPr>
+            </w:pPr>
             <w:r>
+              <w:rPr>
+                <w:rFonts w:ascii="Century Gothic" w:hAnsi="Century Gothic"/>
+              </w:rPr>
               <w:t>{{iva}}</w:t>
             </w:r>
           </w:p>
@@ -731,12 +801,22 @@
             <w:vAlign w:val="center"/>
           </w:tcPr>
           <w:p>
+            <w:pPr>
+              <w:jc w:val="center"/>
+              <w:rPr>
+                <w:rFonts w:ascii="Century Gothic" w:hAnsi="Century Gothic"/>
+              </w:rPr>
+            </w:pPr>
             <w:r>
+              <w:rPr>
+                <w:rFonts w:ascii="Century Gothic" w:hAnsi="Century Gothic"/>
+              </w:rPr>
               <w:t>{{subtotal}}</w:t>
             </w:r>
           </w:p>
         </w:tc>
       </w:tr>
+      <w:bookmarkEnd w:id="0"/>
     </w:tbl>
     <w:p>
       <w:pPr>
@@ -868,12 +948,13 @@
           <w:p>
             <w:pPr>
               <w:rPr>
+                <w:rFonts w:ascii="Century Gothic" w:hAnsi="Century Gothic"/>
                 <w:b/>
               </w:rPr>
             </w:pPr>
-            <w:bookmarkStart w:id="0" w:name="_GoBack" w:colFirst="0" w:colLast="1"/>
             <w:r>
               <w:rPr>
+                <w:rFonts w:ascii="Century Gothic" w:hAnsi="Century Gothic"/>
                 <w:b/>
               </w:rPr>
               <w:t>Concepto</w:t>
@@ -887,11 +968,13 @@
           <w:p>
             <w:pPr>
               <w:rPr>
+                <w:rFonts w:ascii="Century Gothic" w:hAnsi="Century Gothic"/>
                 <w:b/>
               </w:rPr>
             </w:pPr>
             <w:r>
               <w:rPr>
+                <w:rFonts w:ascii="Century Gothic" w:hAnsi="Century Gothic"/>
                 <w:b/>
               </w:rPr>
               <w:t>Detalle</w:t>
@@ -899,7 +982,6 @@
           </w:p>
         </w:tc>
       </w:tr>
-      <w:bookmarkEnd w:id="0"/>
     </w:tbl>
     <w:p>
       <w:pPr>
@@ -968,30 +1050,51 @@
         </w:rPr>
       </w:pPr>
       <w:r>
+        <w:rPr>
+          <w:rFonts w:ascii="Century Gothic" w:hAnsi="Century Gothic"/>
+        </w:rPr>
         <w:t xml:space="preserve">Garantía de </w:t>
       </w:r>
       <w:proofErr w:type="gramStart"/>
       <w:r>
+        <w:rPr>
+          <w:rFonts w:ascii="Century Gothic" w:hAnsi="Century Gothic"/>
+        </w:rPr>
         <w:t xml:space="preserve">{{ </w:t>
       </w:r>
       <w:proofErr w:type="spellStart"/>
       <w:r>
+        <w:rPr>
+          <w:rFonts w:ascii="Century Gothic" w:hAnsi="Century Gothic"/>
+        </w:rPr>
         <w:t>tipo</w:t>
       </w:r>
       <w:proofErr w:type="gramEnd"/>
       <w:r>
+        <w:rPr>
+          <w:rFonts w:ascii="Century Gothic" w:hAnsi="Century Gothic"/>
+        </w:rPr>
         <w:t>_garantia</w:t>
       </w:r>
       <w:proofErr w:type="spellEnd"/>
       <w:r>
+        <w:rPr>
+          <w:rFonts w:ascii="Century Gothic" w:hAnsi="Century Gothic"/>
+        </w:rPr>
         <w:t xml:space="preserve"> }} es de {{ </w:t>
       </w:r>
       <w:proofErr w:type="spellStart"/>
       <w:r>
+        <w:rPr>
+          <w:rFonts w:ascii="Century Gothic" w:hAnsi="Century Gothic"/>
+        </w:rPr>
         <w:t>tiempo_garantia</w:t>
       </w:r>
       <w:proofErr w:type="spellEnd"/>
       <w:r>
+        <w:rPr>
+          <w:rFonts w:ascii="Century Gothic" w:hAnsi="Century Gothic"/>
+        </w:rPr>
         <w:t xml:space="preserve"> }}.</w:t>
       </w:r>
     </w:p>
@@ -1239,19 +1342,7 @@
           <w:szCs w:val="18"/>
           <w:lang w:val="es-ES_tradnl"/>
         </w:rPr>
-        <w:t>VIGENCIA COTIZACION:</w:t>
-      </w:r>
-      <w:r>
-        <w:rPr>
-          <w:rFonts w:ascii="Century Gothic" w:hAnsi="Century Gothic" w:cstheme="minorHAnsi"/>
-          <w:b/>
-          <w:snapToGrid w:val="0"/>
-          <w:spacing w:val="-2"/>
-          <w:sz w:val="18"/>
-          <w:szCs w:val="18"/>
-          <w:lang w:val="es-ES_tradnl"/>
-        </w:rPr>
-        <w:t xml:space="preserve"> </w:t>
+        <w:t xml:space="preserve">VIGENCIA COTIZACION: </w:t>
       </w:r>
       <w:r>
         <w:rPr>
@@ -1614,7 +1705,24 @@
           <w:sz w:val="18"/>
           <w:szCs w:val="18"/>
         </w:rPr>
-        <w:t>leasing</w:t>
+        <w:t xml:space="preserve">leasing con orden de facturación y compromiso de forma de pago antes de la entrega </w:t>
+      </w:r>
+      <w:r>
+        <w:rPr>
+          <w:rFonts w:ascii="Century Gothic" w:hAnsi="Century Gothic"/>
+          <w:sz w:val="18"/>
+          <w:szCs w:val="18"/>
+        </w:rPr>
+        <w:t>de la</w:t>
+      </w:r>
+      <w:r>
+        <w:rPr>
+          <w:rFonts w:ascii="Century Gothic" w:hAnsi="Century Gothic"/>
+          <w:spacing w:val="-36"/>
+          <w:sz w:val="18"/>
+          <w:szCs w:val="18"/>
+        </w:rPr>
+        <w:t xml:space="preserve">  </w:t>
       </w:r>
       <w:r>
         <w:rPr>
@@ -1623,42 +1731,7 @@
           <w:sz w:val="18"/>
           <w:szCs w:val="18"/>
         </w:rPr>
-        <w:t xml:space="preserve"> con orden de facturación y compromiso de forma de pago antes de la entrega </w:t>
-      </w:r>
-      <w:r>
-        <w:rPr>
-          <w:rFonts w:ascii="Century Gothic" w:hAnsi="Century Gothic"/>
-          <w:sz w:val="18"/>
-          <w:szCs w:val="18"/>
-        </w:rPr>
-        <w:t>de la</w:t>
-      </w:r>
-      <w:r>
-        <w:rPr>
-          <w:rFonts w:ascii="Century Gothic" w:hAnsi="Century Gothic"/>
-          <w:spacing w:val="-36"/>
-          <w:sz w:val="18"/>
-          <w:szCs w:val="18"/>
-        </w:rPr>
-        <w:t xml:space="preserve">  </w:t>
-      </w:r>
-      <w:r>
-        <w:rPr>
-          <w:rFonts w:ascii="Century Gothic" w:hAnsi="Century Gothic"/>
-          <w:spacing w:val="-3"/>
-          <w:sz w:val="18"/>
-          <w:szCs w:val="18"/>
-        </w:rPr>
-        <w:t>entidad financiera.</w:t>
-      </w:r>
-      <w:r>
-        <w:rPr>
-          <w:rFonts w:ascii="Century Gothic" w:hAnsi="Century Gothic"/>
-          <w:spacing w:val="-3"/>
-          <w:sz w:val="18"/>
-          <w:szCs w:val="18"/>
-        </w:rPr>
-        <w:t xml:space="preserve"> </w:t>
+        <w:t xml:space="preserve">entidad financiera. </w:t>
       </w:r>
     </w:p>
     <w:p>
@@ -1689,43 +1762,7 @@
           <w:sz w:val="18"/>
           <w:szCs w:val="18"/>
         </w:rPr>
-        <w:t xml:space="preserve"> 25 días después de la legalización del contrato, sujeto la</w:t>
-      </w:r>
-      <w:r>
-        <w:rPr>
-          <w:rFonts w:ascii="Century Gothic" w:hAnsi="Century Gothic"/>
-          <w:spacing w:val="-3"/>
-          <w:sz w:val="18"/>
-          <w:szCs w:val="18"/>
-        </w:rPr>
-        <w:t xml:space="preserve"> confirma</w:t>
-      </w:r>
-      <w:r>
-        <w:rPr>
-          <w:rFonts w:ascii="Century Gothic" w:hAnsi="Century Gothic"/>
-          <w:spacing w:val="-3"/>
-          <w:sz w:val="18"/>
-          <w:szCs w:val="18"/>
-        </w:rPr>
-        <w:t xml:space="preserve">ción </w:t>
-      </w:r>
-      <w:r>
-        <w:rPr>
-          <w:rFonts w:ascii="Century Gothic" w:hAnsi="Century Gothic"/>
-          <w:spacing w:val="-3"/>
-          <w:sz w:val="18"/>
-          <w:szCs w:val="18"/>
-        </w:rPr>
-        <w:t>según disponibilidad en el calendario de producción</w:t>
-      </w:r>
-      <w:r>
-        <w:rPr>
-          <w:rFonts w:ascii="Century Gothic" w:hAnsi="Century Gothic"/>
-          <w:spacing w:val="-3"/>
-          <w:sz w:val="18"/>
-          <w:szCs w:val="18"/>
-        </w:rPr>
-        <w:t xml:space="preserve"> y al conocimiento de la fecha de entrega del chasis.</w:t>
+        <w:t xml:space="preserve"> 25 días después de la legalización del contrato, sujeto la confirmación según disponibilidad en el calendario de producción y al conocimiento de la fecha de entrega del chasis.</w:t>
       </w:r>
     </w:p>
     <w:p>
@@ -1746,57 +1783,15 @@
           <w:sz w:val="18"/>
           <w:szCs w:val="18"/>
         </w:rPr>
-        <w:t>REVISIONES Y AJUSTES:</w:t>
-      </w:r>
-      <w:r>
-        <w:rPr>
-          <w:rFonts w:ascii="Century Gothic" w:hAnsi="Century Gothic"/>
-          <w:b/>
-          <w:bCs/>
-          <w:sz w:val="18"/>
-          <w:szCs w:val="18"/>
-        </w:rPr>
-        <w:t xml:space="preserve"> </w:t>
-      </w:r>
-      <w:r>
-        <w:rPr>
-          <w:rFonts w:ascii="Century Gothic" w:hAnsi="Century Gothic"/>
-          <w:sz w:val="18"/>
-          <w:szCs w:val="18"/>
-        </w:rPr>
-        <w:t xml:space="preserve">Se recomienda realizar una revisión y ajuste a los </w:t>
-      </w:r>
-      <w:r>
-        <w:rPr>
-          <w:rFonts w:ascii="Century Gothic" w:hAnsi="Century Gothic"/>
-          <w:sz w:val="18"/>
-          <w:szCs w:val="18"/>
-        </w:rPr>
-        <w:t>3, 6, 1</w:t>
-      </w:r>
-      <w:r>
-        <w:rPr>
-          <w:rFonts w:ascii="Century Gothic" w:hAnsi="Century Gothic"/>
-          <w:sz w:val="18"/>
-          <w:szCs w:val="18"/>
-        </w:rPr>
-        <w:t>2 y 18 meses, posteriormente de forma anual, con la finalidad de realizar un mantenimiento preventivo y correctivo</w:t>
-      </w:r>
-      <w:r>
-        <w:rPr>
-          <w:rFonts w:ascii="Century Gothic" w:hAnsi="Century Gothic"/>
-          <w:sz w:val="18"/>
-          <w:szCs w:val="18"/>
-        </w:rPr>
-        <w:t xml:space="preserve">, cuyo objetivo </w:t>
-      </w:r>
-      <w:r>
-        <w:rPr>
-          <w:rFonts w:ascii="Century Gothic" w:hAnsi="Century Gothic"/>
-          <w:sz w:val="18"/>
-          <w:szCs w:val="18"/>
-        </w:rPr>
-        <w:t xml:space="preserve">cuyo </w:t>
+        <w:t xml:space="preserve">REVISIONES Y AJUSTES: </w:t>
+      </w:r>
+      <w:r>
+        <w:rPr>
+          <w:rFonts w:ascii="Century Gothic" w:hAnsi="Century Gothic"/>
+          <w:sz w:val="18"/>
+          <w:szCs w:val="18"/>
+        </w:rPr>
+        <w:t xml:space="preserve">Se recomienda realizar una revisión y ajuste a los 3, 6, 12 y 18 meses, posteriormente de forma anual, con la finalidad de realizar un mantenimiento preventivo y correctivo, cuyo objetivo cuyo </w:t>
       </w:r>
       <w:r>
         <w:rPr>
@@ -1805,55 +1800,7 @@
           <w:szCs w:val="18"/>
         </w:rPr>
         <w:lastRenderedPageBreak/>
-        <w:t>objetivo, es dar</w:t>
-      </w:r>
-      <w:r>
-        <w:rPr>
-          <w:rFonts w:ascii="Century Gothic" w:hAnsi="Century Gothic"/>
-          <w:sz w:val="18"/>
-          <w:szCs w:val="18"/>
-        </w:rPr>
-        <w:t xml:space="preserve"> </w:t>
-      </w:r>
-      <w:r>
-        <w:rPr>
-          <w:rFonts w:ascii="Century Gothic" w:hAnsi="Century Gothic"/>
-          <w:sz w:val="18"/>
-          <w:szCs w:val="18"/>
-        </w:rPr>
-        <w:t>un buen seguimiento al ajuste, soldaduras y las partes, determinar según su uso que el producto tenga las</w:t>
-      </w:r>
-      <w:r>
-        <w:rPr>
-          <w:rFonts w:ascii="Century Gothic" w:hAnsi="Century Gothic"/>
-          <w:sz w:val="18"/>
-          <w:szCs w:val="18"/>
-        </w:rPr>
-        <w:t xml:space="preserve"> </w:t>
-      </w:r>
-      <w:r>
-        <w:rPr>
-          <w:rFonts w:ascii="Century Gothic" w:hAnsi="Century Gothic"/>
-          <w:sz w:val="18"/>
-          <w:szCs w:val="18"/>
-        </w:rPr>
-        <w:t>características adecuadas y no vaya a presentar inconvenientes. Valor: 380.000 + IVA; se hace en MDE y</w:t>
-      </w:r>
-      <w:r>
-        <w:rPr>
-          <w:rFonts w:ascii="Century Gothic" w:hAnsi="Century Gothic"/>
-          <w:sz w:val="18"/>
-          <w:szCs w:val="18"/>
-        </w:rPr>
-        <w:t xml:space="preserve"> </w:t>
-      </w:r>
-      <w:r>
-        <w:rPr>
-          <w:rFonts w:ascii="Century Gothic" w:hAnsi="Century Gothic"/>
-          <w:sz w:val="18"/>
-          <w:szCs w:val="18"/>
-        </w:rPr>
-        <w:t>en BOG.</w:t>
+        <w:t>objetivo, es dar un buen seguimiento al ajuste, soldaduras y las partes, determinar según su uso que el producto tenga las características adecuadas y no vaya a presentar inconvenientes. Valor: 380.000 + IVA; se hace en MDE y en BOG.</w:t>
       </w:r>
     </w:p>
     <w:p>
@@ -2048,21 +1995,39 @@
         </w:rPr>
       </w:pPr>
       <w:r>
+        <w:rPr>
+          <w:rFonts w:ascii="Century Gothic" w:hAnsi="Century Gothic"/>
+        </w:rPr>
         <w:t>{{ nombre_asesor }}</w:t>
       </w:r>
       <w:r>
+        <w:rPr>
+          <w:rFonts w:ascii="Century Gothic" w:hAnsi="Century Gothic"/>
+        </w:rPr>
         <w:tab/>
       </w:r>
       <w:r>
+        <w:rPr>
+          <w:rFonts w:ascii="Century Gothic" w:hAnsi="Century Gothic"/>
+        </w:rPr>
         <w:tab/>
       </w:r>
       <w:r>
+        <w:rPr>
+          <w:rFonts w:ascii="Century Gothic" w:hAnsi="Century Gothic"/>
+        </w:rPr>
         <w:tab/>
       </w:r>
       <w:r>
+        <w:rPr>
+          <w:rFonts w:ascii="Century Gothic" w:hAnsi="Century Gothic"/>
+        </w:rPr>
         <w:tab/>
       </w:r>
       <w:r>
+        <w:rPr>
+          <w:rFonts w:ascii="Century Gothic" w:hAnsi="Century Gothic"/>
+        </w:rPr>
         <w:tab/>
         <w:t>FIRMA CLIENTE</w:t>
       </w:r>
@@ -2080,6 +2045,9 @@
         </w:rPr>
       </w:pPr>
       <w:r>
+        <w:rPr>
+          <w:rFonts w:ascii="Century Gothic" w:hAnsi="Century Gothic"/>
+        </w:rPr>
         <w:t>{{ cargo_asesor }}</w:t>
       </w:r>
     </w:p>

</xml_diff>

<commit_message>
Salto de pgina para garantia
</commit_message>
<xml_diff>
--- a/plantillas/plantilla_cotizacion.docx
+++ b/plantillas/plantilla_cotizacion.docx
@@ -648,7 +648,6 @@
                 <w:rFonts w:ascii="Century Gothic" w:hAnsi="Century Gothic"/>
               </w:rPr>
             </w:pPr>
-            <w:bookmarkStart w:id="0" w:name="_GoBack" w:colFirst="0" w:colLast="7"/>
             <w:r>
               <w:rPr>
                 <w:rFonts w:ascii="Century Gothic" w:hAnsi="Century Gothic"/>
@@ -816,7 +815,6 @@
           </w:p>
         </w:tc>
       </w:tr>
-      <w:bookmarkEnd w:id="0"/>
     </w:tbl>
     <w:p>
       <w:pPr>
@@ -1017,6 +1015,65 @@
           <w:szCs w:val="22"/>
         </w:rPr>
       </w:pPr>
+    </w:p>
+    <w:p>
+      <w:pPr>
+        <w:jc w:val="center"/>
+        <w:rPr>
+          <w:rFonts w:ascii="Century Gothic" w:hAnsi="Century Gothic"/>
+          <w:b/>
+          <w:bCs/>
+          <w:sz w:val="22"/>
+          <w:szCs w:val="22"/>
+        </w:rPr>
+      </w:pPr>
+    </w:p>
+    <w:p>
+      <w:pPr>
+        <w:rPr>
+          <w:rFonts w:ascii="Century Gothic" w:hAnsi="Century Gothic"/>
+          <w:b/>
+          <w:bCs/>
+          <w:sz w:val="22"/>
+          <w:szCs w:val="22"/>
+        </w:rPr>
+      </w:pPr>
+      <w:r>
+        <w:rPr>
+          <w:rFonts w:ascii="Century Gothic" w:hAnsi="Century Gothic"/>
+          <w:b/>
+          <w:bCs/>
+          <w:sz w:val="22"/>
+          <w:szCs w:val="22"/>
+        </w:rPr>
+        <w:br w:type="page"/>
+      </w:r>
+    </w:p>
+    <w:p>
+      <w:pPr>
+        <w:jc w:val="center"/>
+        <w:rPr>
+          <w:rFonts w:ascii="Century Gothic" w:hAnsi="Century Gothic"/>
+          <w:b/>
+          <w:bCs/>
+          <w:sz w:val="22"/>
+          <w:szCs w:val="22"/>
+        </w:rPr>
+      </w:pPr>
+    </w:p>
+    <w:p>
+      <w:pPr>
+        <w:jc w:val="center"/>
+        <w:rPr>
+          <w:rFonts w:ascii="Century Gothic" w:hAnsi="Century Gothic"/>
+          <w:b/>
+          <w:bCs/>
+          <w:sz w:val="22"/>
+          <w:szCs w:val="22"/>
+        </w:rPr>
+      </w:pPr>
+      <w:bookmarkStart w:id="0" w:name="_GoBack"/>
+      <w:bookmarkEnd w:id="0"/>
       <w:r>
         <w:rPr>
           <w:rFonts w:ascii="Century Gothic" w:hAnsi="Century Gothic"/>
@@ -1791,16 +1848,7 @@
           <w:sz w:val="18"/>
           <w:szCs w:val="18"/>
         </w:rPr>
-        <w:t xml:space="preserve">Se recomienda realizar una revisión y ajuste a los 3, 6, 12 y 18 meses, posteriormente de forma anual, con la finalidad de realizar un mantenimiento preventivo y correctivo, cuyo objetivo cuyo </w:t>
-      </w:r>
-      <w:r>
-        <w:rPr>
-          <w:rFonts w:ascii="Century Gothic" w:hAnsi="Century Gothic"/>
-          <w:sz w:val="18"/>
-          <w:szCs w:val="18"/>
-        </w:rPr>
-        <w:lastRenderedPageBreak/>
-        <w:t>objetivo, es dar un buen seguimiento al ajuste, soldaduras y las partes, determinar según su uso que el producto tenga las características adecuadas y no vaya a presentar inconvenientes. Valor: 380.000 + IVA; se hace en MDE y en BOG.</w:t>
+        <w:t>Se recomienda realizar una revisión y ajuste a los 3, 6, 12 y 18 meses, posteriormente de forma anual, con la finalidad de realizar un mantenimiento preventivo y correctivo, cuyo objetivo cuyo objetivo, es dar un buen seguimiento al ajuste, soldaduras y las partes, determinar según su uso que el producto tenga las características adecuadas y no vaya a presentar inconvenientes. Valor: 380.000 + IVA; se hace en MDE y en BOG.</w:t>
       </w:r>
     </w:p>
     <w:p>

</xml_diff>

<commit_message>
Salto de linea para garantia,
</commit_message>
<xml_diff>
--- a/plantillas/plantilla_cotizacion.docx
+++ b/plantillas/plantilla_cotizacion.docx
@@ -1006,7 +1006,6 @@
     </w:p>
     <w:p>
       <w:pPr>
-        <w:jc w:val="center"/>
         <w:rPr>
           <w:rFonts w:ascii="Century Gothic" w:hAnsi="Century Gothic"/>
           <w:b/>
@@ -1015,6 +1014,8 @@
           <w:szCs w:val="22"/>
         </w:rPr>
       </w:pPr>
+      <w:bookmarkStart w:id="0" w:name="_GoBack"/>
+      <w:bookmarkEnd w:id="0"/>
     </w:p>
     <w:p>
       <w:pPr>
@@ -1030,6 +1031,7 @@
     </w:p>
     <w:p>
       <w:pPr>
+        <w:jc w:val="center"/>
         <w:rPr>
           <w:rFonts w:ascii="Century Gothic" w:hAnsi="Century Gothic"/>
           <w:b/>
@@ -1038,42 +1040,6 @@
           <w:szCs w:val="22"/>
         </w:rPr>
       </w:pPr>
-      <w:r>
-        <w:rPr>
-          <w:rFonts w:ascii="Century Gothic" w:hAnsi="Century Gothic"/>
-          <w:b/>
-          <w:bCs/>
-          <w:sz w:val="22"/>
-          <w:szCs w:val="22"/>
-        </w:rPr>
-        <w:br w:type="page"/>
-      </w:r>
-    </w:p>
-    <w:p>
-      <w:pPr>
-        <w:jc w:val="center"/>
-        <w:rPr>
-          <w:rFonts w:ascii="Century Gothic" w:hAnsi="Century Gothic"/>
-          <w:b/>
-          <w:bCs/>
-          <w:sz w:val="22"/>
-          <w:szCs w:val="22"/>
-        </w:rPr>
-      </w:pPr>
-    </w:p>
-    <w:p>
-      <w:pPr>
-        <w:jc w:val="center"/>
-        <w:rPr>
-          <w:rFonts w:ascii="Century Gothic" w:hAnsi="Century Gothic"/>
-          <w:b/>
-          <w:bCs/>
-          <w:sz w:val="22"/>
-          <w:szCs w:val="22"/>
-        </w:rPr>
-      </w:pPr>
-      <w:bookmarkStart w:id="0" w:name="_GoBack"/>
-      <w:bookmarkEnd w:id="0"/>
       <w:r>
         <w:rPr>
           <w:rFonts w:ascii="Century Gothic" w:hAnsi="Century Gothic"/>
@@ -1840,6 +1806,7 @@
           <w:sz w:val="18"/>
           <w:szCs w:val="18"/>
         </w:rPr>
+        <w:lastRenderedPageBreak/>
         <w:t xml:space="preserve">REVISIONES Y AJUSTES: </w:t>
       </w:r>
       <w:r>

</xml_diff>